<commit_message>
Handbook: document self-registration + direct signature requests
Add a What's New section to the handbook (and a standalone SignFlow-Whats-New.pdf), and update the Quick-Start, Requestor, Administrator, IT Onboarding, and FAQ guide source for both new features.

Co-Authored-By: Claude Opus 4.8 <noreply@anthropic.com>
</commit_message>
<xml_diff>
--- a/docs/launch-kit/SignFlow-Administrator-Guide.docx
+++ b/docs/launch-kit/SignFlow-Administrator-Guide.docx
@@ -189,6 +189,128 @@
       </w:pPr>
       <w:r>
         <w:t xml:space="preserve">Delete users when needed: their name shows as “—” in past requests, but document history is preserved.</w:t>
+      </w:r>
+    </w:p>
+    <w:p>
+      <w:pPr>
+        <w:pStyle w:val="Heading2"/>
+      </w:pPr>
+      <w:r>
+        <w:t xml:space="preserve">Registrations</w:t>
+      </w:r>
+    </w:p>
+    <w:p>
+      <w:pPr>
+        <w:spacing w:after="100"/>
+      </w:pPr>
+      <w:r>
+        <w:t xml:space="preserve">If self-registration is enabled, people can request an account themselves from the login screen (</w:t>
+      </w:r>
+      <w:r>
+        <w:rPr>
+          <w:b/>
+          <w:bCs/>
+        </w:rPr>
+        <w:t xml:space="preserve">Create an account</w:t>
+      </w:r>
+      <w:r>
+        <w:t xml:space="preserve">). Each request lands in </w:t>
+      </w:r>
+      <w:r>
+        <w:rPr>
+          <w:b/>
+          <w:bCs/>
+        </w:rPr>
+        <w:t xml:space="preserve">Admin → Registrations</w:t>
+      </w:r>
+      <w:r>
+        <w:t xml:space="preserve"> with a pending count.</w:t>
+      </w:r>
+    </w:p>
+    <w:p>
+      <w:pPr>
+        <w:pStyle w:val="ListParagraph"/>
+        <w:numPr>
+          <w:ilvl w:val="0"/>
+          <w:numId w:val="2"/>
+        </w:numPr>
+        <w:spacing w:after="40"/>
+      </w:pPr>
+      <w:r>
+        <w:t xml:space="preserve">Review each request — the name, email, and the team and reporting manager they entered.</w:t>
+      </w:r>
+    </w:p>
+    <w:p>
+      <w:pPr>
+        <w:pStyle w:val="ListParagraph"/>
+        <w:numPr>
+          <w:ilvl w:val="0"/>
+          <w:numId w:val="2"/>
+        </w:numPr>
+        <w:spacing w:after="40"/>
+      </w:pPr>
+      <w:r>
+        <w:rPr>
+          <w:b/>
+          <w:bCs/>
+        </w:rPr>
+        <w:t xml:space="preserve">Approve</w:t>
+      </w:r>
+      <w:r>
+        <w:t xml:space="preserve"> to create the account (as a </w:t>
+      </w:r>
+      <w:r>
+        <w:rPr>
+          <w:b/>
+          <w:bCs/>
+        </w:rPr>
+        <w:t xml:space="preserve">Requestor</w:t>
+      </w:r>
+      <w:r>
+        <w:t xml:space="preserve">) so they can sign in with the password they chose — then set their real role / team under </w:t>
+      </w:r>
+      <w:r>
+        <w:rPr>
+          <w:b/>
+          <w:bCs/>
+        </w:rPr>
+        <w:t xml:space="preserve">Users</w:t>
+      </w:r>
+      <w:r>
+        <w:t xml:space="preserve">.</w:t>
+      </w:r>
+    </w:p>
+    <w:p>
+      <w:pPr>
+        <w:pStyle w:val="ListParagraph"/>
+        <w:numPr>
+          <w:ilvl w:val="0"/>
+          <w:numId w:val="2"/>
+        </w:numPr>
+        <w:spacing w:after="40"/>
+      </w:pPr>
+      <w:r>
+        <w:rPr>
+          <w:b/>
+          <w:bCs/>
+        </w:rPr>
+        <w:t xml:space="preserve">Reject</w:t>
+      </w:r>
+      <w:r>
+        <w:t xml:space="preserve">, with an optional reason, if it isn’t a legitimate request.</w:t>
+      </w:r>
+    </w:p>
+    <w:p>
+      <w:pPr>
+        <w:pStyle w:val="ListParagraph"/>
+        <w:numPr>
+          <w:ilvl w:val="0"/>
+          <w:numId w:val="2"/>
+        </w:numPr>
+        <w:spacing w:after="40"/>
+      </w:pPr>
+      <w:r>
+        <w:t xml:space="preserve">Until you approve them, a registrant cannot sign in — the approval is the gate.</w:t>
       </w:r>
     </w:p>
     <w:p>

</xml_diff>